<commit_message>
fix(homework-docx): keep the teacher answer key off the public homework files
Generated homework.docx carried an "Answer Key (Teacher)" page on a public
URL. The public file now ends before the key; the full sheet ships as
homework-answer-key.docx, which the teacher-surface gate (any path containing
"answer-key") keeps behind login. validate:docx-a11y fails any public
homework file that carries the key.

Claude-Session: https://claude.ai/code/session_012qyRUN7tbhAYqc56QsRHYg
</commit_message>
<xml_diff>
--- a/lessons/1-1-group1/homework.docx
+++ b/lessons/1-1-group1/homework.docx
@@ -959,268 +959,6 @@
         <w:t xml:space="preserve">______________________________________________________________________</w:t>
       </w:r>
     </w:p>
-    <w:p>
-      <w:r>
-        <w:br w:type="page"/>
-      </w:r>
-    </w:p>
-    <w:p>
-      <w:pPr>
-        <w:pStyle w:val="Heading1"/>
-        <w:spacing w:after="120"/>
-      </w:pPr>
-      <w:r>
-        <w:rPr>
-          <w:b/>
-          <w:bCs/>
-        </w:rPr>
-        <w:t xml:space="preserve">Answer Key (Teacher)</w:t>
-      </w:r>
-    </w:p>
-    <w:p>
-      <w:pPr>
-        <w:spacing w:after="40" w:before="0"/>
-      </w:pPr>
-      <w:r>
-        <w:rPr>
-          <w:b/>
-          <w:bCs/>
-        </w:rPr>
-        <w:t xml:space="preserve">1. C. About 80</w:t>
-      </w:r>
-    </w:p>
-    <w:p>
-      <w:pPr>
-        <w:spacing w:after="20" w:before="0"/>
-      </w:pPr>
-      <w:r>
-        <w:t xml:space="preserve">     20 cars with about 4 riders each is 20 × 4, which is about 80 people.</w:t>
-      </w:r>
-    </w:p>
-    <w:p>
-      <w:pPr>
-        <w:spacing w:after="80" w:before="0"/>
-      </w:pPr>
-      <w:r>
-        <w:rPr>
-          <w:i/>
-          <w:iCs/>
-        </w:rPr>
-        <w:t xml:space="preserve">     Watch for: Believing that 'doing math' only counts when it happens on paper in a classroom.</w:t>
-      </w:r>
-    </w:p>
-    <w:p>
-      <w:pPr>
-        <w:spacing w:after="40" w:before="0"/>
-      </w:pPr>
-      <w:r>
-        <w:rPr>
-          <w:b/>
-          <w:bCs/>
-        </w:rPr>
-        <w:t xml:space="preserve">2. B. 70 + 8.5</w:t>
-      </w:r>
-    </w:p>
-    <w:p>
-      <w:pPr>
-        <w:spacing w:after="20" w:before="0"/>
-      </w:pPr>
-      <w:r>
-        <w:t xml:space="preserve">     70 + 8.5 = 78.5. Decomposing means the parts must add back to the original number.</w:t>
-      </w:r>
-    </w:p>
-    <w:p>
-      <w:pPr>
-        <w:spacing w:after="80" w:before="0"/>
-      </w:pPr>
-      <w:r>
-        <w:rPr>
-          <w:i/>
-          <w:iCs/>
-        </w:rPr>
-        <w:t xml:space="preserve">     Watch for: Believing that 'doing math' only counts when it happens on paper in a classroom.</w:t>
-      </w:r>
-    </w:p>
-    <w:p>
-      <w:pPr>
-        <w:spacing w:after="40" w:before="0"/>
-      </w:pPr>
-      <w:r>
-        <w:rPr>
-          <w:b/>
-          <w:bCs/>
-        </w:rPr>
-        <w:t xml:space="preserve">3. C. Yes — 20 is close to 19, and 20 × 4 = 80 is close to the exact 76</w:t>
-      </w:r>
-    </w:p>
-    <w:p>
-      <w:pPr>
-        <w:spacing w:after="20" w:before="0"/>
-      </w:pPr>
-      <w:r>
-        <w:t xml:space="preserve">     19 × 4 = 76 and 20 × 4 = 80. Mia's estimate is 4 riders high — close enough to plan with, which is what an estimate is for.</w:t>
-      </w:r>
-    </w:p>
-    <w:p>
-      <w:pPr>
-        <w:spacing w:after="80" w:before="0"/>
-      </w:pPr>
-      <w:r>
-        <w:rPr>
-          <w:i/>
-          <w:iCs/>
-        </w:rPr>
-        <w:t xml:space="preserve">     Watch for: Believing that 'doing math' only counts when it happens on paper in a classroom.</w:t>
-      </w:r>
-    </w:p>
-    <w:p>
-      <w:pPr>
-        <w:spacing w:after="40" w:before="0"/>
-      </w:pPr>
-      <w:r>
-        <w:rPr>
-          <w:b/>
-          <w:bCs/>
-        </w:rPr>
-        <w:t xml:space="preserve">4. B. Round 19 to 20 — then 20 × 4 is a double of a double</w:t>
-      </w:r>
-    </w:p>
-    <w:p>
-      <w:pPr>
-        <w:spacing w:after="20" w:before="0"/>
-      </w:pPr>
-      <w:r>
-        <w:t xml:space="preserve">     20 is one step from 19, and 20 × 4 is easy: double 20 to 40, double again to 80. Moving 4 up to 10 would more than double the riders in every car.</w:t>
-      </w:r>
-    </w:p>
-    <w:p>
-      <w:pPr>
-        <w:spacing w:after="80" w:before="0"/>
-      </w:pPr>
-      <w:r>
-        <w:rPr>
-          <w:i/>
-          <w:iCs/>
-        </w:rPr>
-        <w:t xml:space="preserve">     Watch for: Believing that 'doing math' only counts when it happens on paper in a classroom.</w:t>
-      </w:r>
-    </w:p>
-    <w:p>
-      <w:pPr>
-        <w:spacing w:after="40" w:before="0"/>
-      </w:pPr>
-      <w:r>
-        <w:rPr>
-          <w:b/>
-          <w:bCs/>
-        </w:rPr>
-        <w:t xml:space="preserve">5. Open response — answers will vary.</w:t>
-      </w:r>
-    </w:p>
-    <w:p>
-      <w:pPr>
-        <w:spacing w:after="40" w:before="0"/>
-      </w:pPr>
-      <w:r>
-        <w:rPr>
-          <w:b/>
-          <w:bCs/>
-        </w:rPr>
-        <w:t xml:space="preserve">6. D. Ana's is fast for a quick head count; Ben's is what the operator needs to sell tickets</w:t>
-      </w:r>
-    </w:p>
-    <w:p>
-      <w:pPr>
-        <w:spacing w:after="20" w:before="0"/>
-      </w:pPr>
-      <w:r>
-        <w:t xml:space="preserve">     22 × 4 = 88, and 20 × 4 = 80. Both are good mathematics doing different jobs: Ana's is quick and close, Ben's is exact. Choosing between them is a decision about what the number is for.</w:t>
-      </w:r>
-    </w:p>
-    <w:p>
-      <w:pPr>
-        <w:spacing w:after="80" w:before="0"/>
-      </w:pPr>
-      <w:r>
-        <w:rPr>
-          <w:i/>
-          <w:iCs/>
-        </w:rPr>
-        <w:t xml:space="preserve">     Watch for: Believing that 'doing math' only counts when it happens on paper in a classroom.</w:t>
-      </w:r>
-    </w:p>
-    <w:p>
-      <w:pPr>
-        <w:spacing w:after="40" w:before="0"/>
-      </w:pPr>
-      <w:r>
-        <w:rPr>
-          <w:b/>
-          <w:bCs/>
-        </w:rPr>
-        <w:t xml:space="preserve">7. B. It would mean about 9 people squeezed into every car, not about 4</w:t>
-      </w:r>
-    </w:p>
-    <w:p>
-      <w:pPr>
-        <w:spacing w:after="20" w:before="0"/>
-      </w:pPr>
-      <w:r>
-        <w:t xml:space="preserve">     200 riders shared across 22 cars is about 9 per car (200 ÷ 22 ≈ 9), and the cars hold about 4. Checking an estimate against the quantity it came from is how you catch one that has drifted.</w:t>
-      </w:r>
-    </w:p>
-    <w:p>
-      <w:pPr>
-        <w:spacing w:after="80" w:before="0"/>
-      </w:pPr>
-      <w:r>
-        <w:rPr>
-          <w:i/>
-          <w:iCs/>
-        </w:rPr>
-        <w:t xml:space="preserve">     Watch for: Believing that 'doing math' only counts when it happens on paper in a classroom.</w:t>
-      </w:r>
-    </w:p>
-    <w:p>
-      <w:pPr>
-        <w:spacing w:after="40" w:before="0"/>
-      </w:pPr>
-      <w:r>
-        <w:rPr>
-          <w:b/>
-          <w:bCs/>
-        </w:rPr>
-        <w:t xml:space="preserve">8. Open response — answers will vary.</w:t>
-      </w:r>
-    </w:p>
-    <w:p>
-      <w:pPr>
-        <w:spacing w:after="40" w:before="0"/>
-      </w:pPr>
-      <w:r>
-        <w:rPr>
-          <w:b/>
-          <w:bCs/>
-        </w:rPr>
-        <w:t xml:space="preserve">9. Fix our table's thinking</w:t>
-      </w:r>
-    </w:p>
-    <w:p>
-      <w:pPr>
-        <w:spacing w:after="20" w:before="0"/>
-      </w:pPr>
-      <w:r>
-        <w:t xml:space="preserve">     The mistake is in Step 2.</w:t>
-      </w:r>
-    </w:p>
-    <w:p>
-      <w:pPr>
-        <w:spacing w:after="20" w:before="0"/>
-      </w:pPr>
-      <w:r>
-        <w:t xml:space="preserve">     Correct work: The correct answer is Round 19 to 20 — then 20 × 4 is a double of a double. 20 is one step from 19, and 20 × 4 is easy: double 20 to 40, double again to 80. Moving 4 up to 10 would more than double the riders in every car.</w:t>
-      </w:r>
-    </w:p>
     <w:sectPr>
       <w:pgSz w:w="11906" w:h="16838" w:orient="portrait"/>
       <w:pgMar w:top="720" w:right="900" w:bottom="720" w:left="900" w:header="708" w:footer="708" w:gutter="0"/>

</xml_diff>